<commit_message>
Agrega enlace oficial de Netlify en informe Word y portal web
</commit_message>
<xml_diff>
--- a/TRABAJO_GRUPAL_Analisis_realidad_FINAL_v2.docx
+++ b/TRABAJO_GRUPAL_Analisis_realidad_FINAL_v2.docx
@@ -350,13 +350,34 @@
     </w:p>
     <w:p>
       <w:pPr>
-        <w:spacing w:line="360" w:lineRule="auto"/>
+        <w:spacing w:before="120" w:after="120" w:line="240" w:lineRule="auto"/>
         <w:jc w:val="center"/>
         <w:rPr>
           <w:sz w:val="24"/>
           <w:szCs w:val="24"/>
         </w:rPr>
       </w:pPr>
+      <w:r>
+        <w:rPr>
+          <w:b/>
+          <w:bCs/>
+          <w:sz w:val="24"/>
+          <w:szCs w:val="24"/>
+        </w:rPr>
+        <w:t xml:space="preserve">ENLACE DEL BLOG: </w:t>
+      </w:r>
+      <w:hyperlink r:id="rIdBlogNetlify" w:history="1">
+        <w:r>
+          <w:rPr>
+            <w:rStyle w:val="Hipervnculo"/>
+            <w:color w:val="0563C1"/>
+            <w:u w:val="single"/>
+            <w:sz w:val="24"/>
+            <w:szCs w:val="24"/>
+          </w:rPr>
+          <w:t>https://blog-realidad-nacional-ucsur.netlify.app/</w:t>
+        </w:r>
+      </w:hyperlink>
     </w:p>
     <w:p>
       <w:pPr>

</xml_diff>